<commit_message>
test(docx): add nested list with empty spacer paragraphs to docx_lists
Signed-off-by: Taran Mamidala <mamidalataran6333@gmail.com>
</commit_message>
<xml_diff>
--- a/tests/data/docx/sources/docx_lists.docx
+++ b/tests/data/docx/sources/docx_lists.docx
@@ -1216,6 +1216,83 @@
       </w:pPr>
       <w:r>
         <w:t>Item D</w:t>
+      </w:r>
+    </w:p>
+    <w:p>
+      <w:r>
+        <w:br w:type="page"/>
+      </w:r>
+    </w:p>
+    <w:p>
+      <w:pPr>
+        <w:pStyle w:val="Heading3"/>
+      </w:pPr>
+      <w:r>
+        <w:t>Test 13: Nested list items separated by empty paragraphs</w:t>
+      </w:r>
+    </w:p>
+    <w:p>
+      <w:pPr>
+        <w:pStyle w:val="ListParagraph"/>
+        <w:numPr>
+          <w:ilvl w:val="0"/>
+          <w:numId w:val="9205"/>
+        </w:numPr>
+      </w:pPr>
+      <w:r>
+        <w:t>Prepare the site</w:t>
+      </w:r>
+    </w:p>
+    <w:p/>
+    <w:p>
+      <w:pPr>
+        <w:pStyle w:val="ListParagraph"/>
+        <w:numPr>
+          <w:ilvl w:val="1"/>
+          <w:numId w:val="9205"/>
+        </w:numPr>
+      </w:pPr>
+      <w:r>
+        <w:t>Clear debris</w:t>
+      </w:r>
+    </w:p>
+    <w:p/>
+    <w:p>
+      <w:pPr>
+        <w:pStyle w:val="ListParagraph"/>
+        <w:numPr>
+          <w:ilvl w:val="1"/>
+          <w:numId w:val="9205"/>
+        </w:numPr>
+      </w:pPr>
+      <w:r>
+        <w:t>Level the ground</w:t>
+      </w:r>
+    </w:p>
+    <w:p/>
+    <w:p>
+      <w:pPr>
+        <w:pStyle w:val="ListParagraph"/>
+        <w:numPr>
+          <w:ilvl w:val="0"/>
+          <w:numId w:val="9205"/>
+        </w:numPr>
+      </w:pPr>
+      <w:r>
+        <w:t>Install the inverter</w:t>
+      </w:r>
+    </w:p>
+    <w:p/>
+    <w:p>
+      <w:pPr>
+        <w:pStyle w:val="ListParagraph"/>
+        <w:numPr>
+          <w:ilvl w:val="1"/>
+          <w:numId w:val="9205"/>
+        </w:numPr>
+      </w:pPr>
+      <w:r>
+        <w:t>Mount the bracket</w:t>
       </w:r>
     </w:p>
     <w:sectPr>
@@ -2027,6 +2104,9 @@
     </w:lvl>
   </w:abstractNum>
   <w:num w:numId="9203">
+    <w:abstractNumId w:val="9212"/>
+  </w:num>
+  <w:num w:numId="9205">
     <w:abstractNumId w:val="9212"/>
   </w:num>
 </w:numbering>

</xml_diff>